<commit_message>
Add strategic clinical and technical defense answering why each of the 3 datasets was chosen
</commit_message>
<xml_diff>
--- a/PRESENTATION_GUIDE_FULL_TEAM.docx
+++ b/PRESENTATION_GUIDE_FULL_TEAM.docx
@@ -884,6 +884,77 @@
           </w:p>
         </w:tc>
       </w:tr>
+      <w:tr>
+        <w:tc>
+          <w:tcPr>
+            <w:tcW w:type="dxa" w:w="3168"/>
+            <w:shd w:fill="F8FAFC"/>
+            <w:tcMar>
+              <w:top w:w="60" w:type="dxa"/>
+              <w:bottom w:w="60" w:type="dxa"/>
+              <w:left w:w="80" w:type="dxa"/>
+              <w:right w:w="80" w:type="dxa"/>
+            </w:tcMar>
+          </w:tcPr>
+          <w:p>
+            <w:r>
+              <w:rPr>
+                <w:rFonts w:ascii="Arial" w:hAnsi="Arial"/>
+                <w:b/>
+                <w:color w:val="0F172A"/>
+                <w:sz w:val="17"/>
+              </w:rPr>
+              <w:t>Q7. Why were these 3 specific datasets chosen?</w:t>
+            </w:r>
+          </w:p>
+        </w:tc>
+        <w:tc>
+          <w:tcPr>
+            <w:tcW w:type="dxa" w:w="1872"/>
+            <w:shd w:fill="F8FAFC"/>
+            <w:tcMar>
+              <w:top w:w="60" w:type="dxa"/>
+              <w:bottom w:w="60" w:type="dxa"/>
+              <w:left w:w="80" w:type="dxa"/>
+              <w:right w:w="80" w:type="dxa"/>
+            </w:tcMar>
+          </w:tcPr>
+          <w:p>
+            <w:r>
+              <w:rPr>
+                <w:rFonts w:ascii="Arial" w:hAnsi="Arial"/>
+                <w:b/>
+                <w:color w:val="0F172A"/>
+                <w:sz w:val="17"/>
+              </w:rPr>
+              <w:t>Full Team</w:t>
+            </w:r>
+          </w:p>
+        </w:tc>
+        <w:tc>
+          <w:tcPr>
+            <w:tcW w:type="dxa" w:w="4752"/>
+            <w:shd w:fill="F8FAFC"/>
+            <w:tcMar>
+              <w:top w:w="60" w:type="dxa"/>
+              <w:bottom w:w="60" w:type="dxa"/>
+              <w:left w:w="80" w:type="dxa"/>
+              <w:right w:w="80" w:type="dxa"/>
+            </w:tcMar>
+          </w:tcPr>
+          <w:p>
+            <w:r>
+              <w:rPr>
+                <w:rFonts w:ascii="Arial" w:hAnsi="Arial"/>
+                <w:b w:val="0"/>
+                <w:color w:val="0F172A"/>
+                <w:sz w:val="17"/>
+              </w:rPr>
+              <w:t>1. RCT Tabular severs confounding by indication to isolate true CATE; 2. Stanford PACS 100k unlocks dark clinical text without &gt;$1M annotation costs; 3. NIH ChestX-ray14 provides realistic 14-disease multi-label co-occurrence and 1% imbalance.</w:t>
+            </w:r>
+          </w:p>
+        </w:tc>
+      </w:tr>
     </w:tbl>
     <w:sectPr>
       <w:pgSz w:w="12240" w:h="15840"/>

</xml_diff>